<commit_message>
feat(render): HTML markdown, PDF ToC/summary/charts, decoded CVSS, branded DOCX
- HTML prose rendered via pulldown-cmark (raw HTML stripped) + print stylesheet
  (was showing literal Markdown).
- PDF: Table of Contents + real numbered headings (findings are headings now),
  findings summary table, severity-distribution bar; height-constrained images
  with figure numbers; breakable/wrapping code blocks.
- CVSS vector decoded into a localized labelled grid (+ severity-colored score).
- MD->Typst converter: tables, blockquotes, nested lists; narrowed over-escaping.
- reference.docx rebranded (violet accent, Inter + JetBrains Mono) to match PDF/HTML.

Verified: cargo fmt + clippy -D warnings clean, 99 backend tests green (themes
compile, new markup/cvss/html tests); rebranded reference.docx accepted by pandoc.
</commit_message>
<xml_diff>
--- a/src-tauri/resources/pandoc/reference.docx
+++ b/src-tauri/resources/pandoc/reference.docx
@@ -1096,7 +1096,7 @@
     <w:name w:val="Verbatim Char"/>
     <w:basedOn w:val="BodyTextChar"/>
     <w:rPr>
-      <w:rFonts w:ascii="Consolas" w:hAnsi="Consolas"/>
+      <w:rFonts w:ascii="JetBrains Mono" w:hAnsi="JetBrains Mono"/>
       <w:sz w:val="22"/>
     </w:rPr>
   </w:style>
@@ -1156,7 +1156,7 @@
         <a:srgbClr val="E8E8E8"/>
       </a:lt2>
       <a:accent1>
-        <a:srgbClr val="156082"/>
+        <a:srgbClr val="7C5CFF"/>
       </a:accent1>
       <a:accent2>
         <a:srgbClr val="E97132"/>
@@ -1182,7 +1182,7 @@
     </a:clrScheme>
     <a:fontScheme name="Office">
       <a:majorFont>
-        <a:latin typeface="Aptos Display" panose="02110004020202020204"/>
+        <a:latin typeface="Inter" panose="02110004020202020204"/>
         <a:ea typeface=""/>
         <a:cs typeface=""/>
         <a:font script="Jpan" typeface="游ゴシック Light"/>
@@ -1234,7 +1234,7 @@
         <a:font script="Tfng" typeface="Ebrima"/>
       </a:majorFont>
       <a:minorFont>
-        <a:latin typeface="Aptos" panose="02110004020202020204"/>
+        <a:latin typeface="Inter" panose="02110004020202020204"/>
         <a:ea typeface=""/>
         <a:cs typeface=""/>
         <a:font script="Jpan" typeface="游明朝"/>

</xml_diff>